<commit_message>
R1 package: full recheck, concise response letter, consistency fixes
- Harmonise 'AI-assisted early warning' terminology (2.3, 2.4.1, 3.1)
- Add COREQ-supporting statements (2.5, 2.10) and cross-site
  interpretation (4.6) for Editor E1
- Tighten new manuscript text; remove redundancy
- Rewrite response letter concisely; all 17 quotes verified verbatim,
  highlighted, and located
- Add AI-disclosure note for author decision; update audit report
- Add verification scripts

Co-Authored-By: Claude Opus 5.5 <noreply@anthropic.com>
Claude-Session: https://claude.ai/code/session_01JkvFf7XfdbY5dmuffLJMTa
</commit_message>
<xml_diff>
--- a/R1_Resubmission/Manuscript_Revised_Clean.docx
+++ b/R1_Resubmission/Manuscript_Revised_Clean.docx
@@ -598,7 +598,7 @@
         <w:rPr>
           <w:rFonts w:asciiTheme="majorBidi" w:hAnsiTheme="majorBidi" w:cstheme="majorBidi"/>
         </w:rPr>
-        <w:t xml:space="preserve"> Vision 2030, launched in 2016, is Saudi Arabia’s national strategic framework for economic diversification and the modernisation of public services; its Health Sector Transformation Program aims to restructure the health system to improve access, quality, and efficiency, including through the expansion of e-health and digital services [31]. Within this agenda, digital health transformation and AI integration have become strategic national priorities, with substantial investment in smart hospital infrastructure, advanced monitoring technologies, and intelligent clinical decision-support systems [32, 33].</w:t>
+        <w:t xml:space="preserve"> Vision 2030, launched in 2016, is Saudi Arabia’s national framework for economic diversification and public-sector modernisation; its Health Sector Transformation Program aims to improve access, quality, and efficiency, partly through expanded e-health and digital services [31]. Within this agenda, digital health transformation and AI integration have become strategic national priorities, with substantial investment in smart hospital infrastructure, advanced monitoring technologies, and intelligent clinical decision-support systems [32, 33].</w:t>
       </w:r>
       <w:r>
         <w:rPr>
@@ -1083,7 +1083,7 @@
           <w:sz w:val="20"/>
           <w:szCs w:val="20"/>
         </w:rPr>
-        <w:t xml:space="preserve">. The framework was developed by the authors as a non-causal sensitising heuristic, drawing on Tanner’s clinical judgment model [43], sociotechnical perspectives on health information technology [44], and literature on trust in automation and alarm fatigue [45, 46]. The figure was created by the authors; no artificial intelligence tools were used in its creation or enhancement.</w:t>
+        <w:t xml:space="preserve">. The framework is a non-causal sensitising heuristic developed by the authors (Section 2.2). No artificial intelligence tools were used to create or enhance this figure.</w:t>
       </w:r>
     </w:p>
     <w:p>
@@ -1139,27 +1139,19 @@
         <w:rPr>
           <w:rFonts w:asciiTheme="majorBidi" w:hAnsiTheme="majorBidi" w:cstheme="majorBidi"/>
         </w:rPr>
-        <w:t xml:space="preserve">The study was conducted across four tertiary-level hospitals, designated Hospital A, Hospital B, Hospital C, and Hospital D, within a regional health cluster in northern Saudi Arabia. Each hospital provided adult critical care services and had operational AI-assisted early warning or clinical decision-support systems integrated into routine nursing workflows at the time of recruitment. A multi-site design was used to capture variation in nurses’ experiences across institutional settings while maintaining contextual comparability</w:t>
-      </w:r>
-      <w:r>
-        <w:rPr>
-          <w:rFonts w:asciiTheme="majorBidi" w:hAnsiTheme="majorBidi" w:cs="Times New Roman"/>
-          <w:rtl/>
-        </w:rPr>
-        <w:t>.</w:t>
-      </w:r>
-      <w:r>
-        <w:rPr>
-          <w:rFonts w:asciiTheme="majorBidi" w:hAnsiTheme="majorBidi" w:cstheme="majorBidi"/>
-        </w:rPr>
-        <w:t xml:space="preserve"> The target population comprised registered nurses currently employed in adult critical care units across the four participating hospitals. Purposive criterion-based sampling was used to recruit participants with direct experience of the phenomenon under study, while also seeking variation in years of experience, educational background, nationality, and hospital site</w:t>
-      </w:r>
-      <w:r>
-        <w:rPr>
-          <w:rFonts w:asciiTheme="majorBidi" w:hAnsiTheme="majorBidi" w:cs="Times New Roman"/>
-          <w:rtl/>
-        </w:rPr>
-        <w:t>.</w:t>
+        <w:t xml:space="preserve">The study was conducted across four tertiary-level hospitals, designated Hospital A, Hospital B, Hospital C, and Hospital D, within a regional health cluster in northern Saudi Arabia.</w:t>
+      </w:r>
+      <w:r>
+        <w:rPr>
+          <w:rFonts w:asciiTheme="majorBidi" w:hAnsiTheme="majorBidi" w:cstheme="majorBidi"/>
+        </w:rPr>
+        <w:t xml:space="preserve"> Each hospital provided adult critical care services and had operational AI-assisted early warning systems (as defined below) integrated into routine nursing workflows at the time of recruitment.</w:t>
+      </w:r>
+      <w:r>
+        <w:rPr>
+          <w:rFonts w:asciiTheme="majorBidi" w:hAnsiTheme="majorBidi" w:cstheme="majorBidi"/>
+        </w:rPr>
+        <w:t xml:space="preserve"> A multi-site design was used to capture variation in nurses’ experiences across institutional settings while maintaining contextual comparability. The target population comprised registered nurses currently employed in adult critical care units across the four participating hospitals. Purposive criterion-based sampling was used to recruit participants with direct experience of the phenomenon under study, while also seeking variation in years of experience, educational background, nationality, and hospital site.</w:t>
       </w:r>
     </w:p>
     <w:p>
@@ -1176,7 +1168,7 @@
         <w:rPr>
           <w:rFonts w:asciiTheme="majorBidi" w:hAnsiTheme="majorBidi" w:cstheme="majorBidi"/>
         </w:rPr>
-        <w:t xml:space="preserve">For this study, AI-assisted early warning systems were defined as systems that apply machine-learning or other data-driven predictive algorithms to multiple, continuously updated physiological, laboratory, and clinical data to generate patient-specific deterioration risk estimates or alerts. Conventional single-parameter monitor alarms and rule-based aggregate early warning scores that apply fixed thresholds were not considered AI-assisted, although conventional monitor alarms operated alongside the AI-assisted systems in all participating units. The AI-assisted systems in use at each site, including their purpose, AI component, alert types, integration into nursing workflow, duration of implementation, training provision, and local response protocols, are summarised in Table 1, together with participants’ self-reported duration of system use, training, and prior experience with similar systems. Site-level information was obtained from [AUTHOR: insert source, e.g., hospital nursing informatics departments and vendor technical documentation]. Vendor and product names are withheld to preserve institutional anonymity.</w:t>
+        <w:t xml:space="preserve">For this study, AI-assisted early warning systems were defined as systems that apply machine-learning or other data-driven predictive algorithms to multiple, continuously updated physiological, laboratory, and clinical data to generate patient-specific deterioration risk estimates or alerts. Single-parameter monitor alarms and rule-based scores with fixed thresholds were not considered AI-assisted, although monitor alarms operated alongside the AI-assisted systems in all units. Table 1 summarises each site’s system (purpose, AI component, alert types, workflow integration, implementation period, training, and response protocol) and participants’ self-reported exposure. Site-level information was obtained from [AUTHOR: insert source, e.g., hospital nursing informatics departments]; vendor and product names are withheld to preserve institutional anonymity.</w:t>
       </w:r>
     </w:p>
     <w:p>
@@ -2709,7 +2701,7 @@
           <w:sz w:val="20"/>
           <w:szCs w:val="20"/>
         </w:rPr>
-        <w:t xml:space="preserve">Note: Site-level information was obtained from [AUTHOR: insert source]; participant data were drawn from the demographic form (Supplementary File S1). Vendor and product names are withheld to protect institutional anonymity. The response protocol at Hospital D is as described by participants [AUTHOR: confirm against the written hospital protocol]. AI, artificial intelligence.</w:t>
+        <w:t xml:space="preserve">Note: Participant exposure data are from the demographic form (Supplementary File S1). Vendor and product names are withheld to protect institutional anonymity. The Hospital D protocol is as described by participants [AUTHOR: confirm against the written protocol]. AI, artificial intelligence.</w:t>
       </w:r>
     </w:p>
     <w:p>
@@ -2805,14 +2797,19 @@
         <w:rPr>
           <w:rFonts w:asciiTheme="majorBidi" w:hAnsiTheme="majorBidi" w:cstheme="majorBidi"/>
         </w:rPr>
-        <w:t>Participants were eligible if they were registered nurses currently employed in an adult critical care unit at one of the four participating hospitals, had at least one year of critical care nursing experience, had direct experience using AI-assisted early warning or clinical decision-support systems in their clinical role, were able to communicate in Arabic or English, and provided written informed consent</w:t>
-      </w:r>
-      <w:r>
-        <w:rPr>
-          <w:rFonts w:asciiTheme="majorBidi" w:hAnsiTheme="majorBidi" w:cs="Times New Roman"/>
-          <w:rtl/>
-        </w:rPr>
-        <w:t>.</w:t>
+        <w:t xml:space="preserve">Participants were eligible if they were registered nurses currently employed in an adult critical care unit at one of the four participating hospitals, had at least one year of critical care nursing experience,</w:t>
+      </w:r>
+      <w:r>
+        <w:rPr>
+          <w:rFonts w:asciiTheme="majorBidi" w:hAnsiTheme="majorBidi" w:cstheme="majorBidi"/>
+        </w:rPr>
+        <w:t xml:space="preserve"> had direct experience using the AI-assisted early warning system in use in their unit (Section 2.3) in their clinical role,</w:t>
+      </w:r>
+      <w:r>
+        <w:rPr>
+          <w:rFonts w:asciiTheme="majorBidi" w:hAnsiTheme="majorBidi" w:cstheme="majorBidi"/>
+        </w:rPr>
+        <w:t xml:space="preserve"> were able to communicate in Arabic or English, and provided written informed consent.</w:t>
       </w:r>
     </w:p>
     <w:p>
@@ -2929,7 +2926,7 @@
         <w:rPr>
           <w:rFonts w:asciiTheme="majorBidi" w:hAnsiTheme="majorBidi" w:cstheme="majorBidi"/>
         </w:rPr>
-        <w:t xml:space="preserve"> Overall, [AUTHOR: n] interviews were conducted face-to-face and [AUTHOR: n] by video; [AUTHOR: n] were conducted in Arabic and [AUTHOR: n] in English. Before each interview, participants completed a brief demographic form capturing age, sex, nationality, years of critical care experience, highest educational qualification, the AI-assisted system used in their unit, duration of use of that system, training received, and prior experience with similar systems elsewhere (Supplementary File S1).</w:t>
+        <w:t xml:space="preserve"> Overall, [AUTHOR: n] interviews were conducted face-to-face and [AUTHOR: n] by video; [AUTHOR: n] were conducted in Arabic and [AUTHOR: n] in English. Only the participant and the interviewer were present at each interview, and each participant was interviewed once [AUTHOR: confirm both statements]. Before each interview, participants completed a brief demographic form capturing age, sex, nationality, years of critical care experience, highest educational qualification, the AI-assisted system used in their unit, duration of use of that system, training received, and prior experience with similar systems elsewhere (Supplementary File S1).</w:t>
       </w:r>
       <w:r>
         <w:rPr>
@@ -3005,7 +3002,7 @@
         <w:rPr>
           <w:rFonts w:asciiTheme="majorBidi" w:hAnsiTheme="majorBidi" w:cstheme="majorBidi"/>
         </w:rPr>
-        <w:t xml:space="preserve"> These topics were organised into four areas of inquiry derived from the study objectives and the orienting framework, followed by closing questions. During data collection, the guide sections were labelled by area of inquiry only; they were not linked to themes, which were developed during analysis (Section 2.8).</w:t>
+        <w:t xml:space="preserve"> These topics were organised into four areas of inquiry derived from the study objectives and the orienting framework, followed by closing questions. During data collection, guide sections were labelled by area of inquiry only; themes were developed during analysis (Section 2.8).</w:t>
       </w:r>
       <w:r>
         <w:rPr>
@@ -3215,7 +3212,7 @@
         <w:rPr>
           <w:rFonts w:asciiTheme="majorBidi" w:hAnsiTheme="majorBidi" w:cstheme="majorBidi"/>
         </w:rPr>
-        <w:t xml:space="preserve">The analysis combined deductive and inductive elements. Deductively, the orienting framework informed the four areas of inquiry in the interview guide and therefore what participants were invited to discuss; no codebook or predefined themes were applied. Inductively, initial codes were generated from participants’ accounts at both semantic and latent levels, and candidate themes were developed around central organising concepts that captured shared patterns of meaning across the dataset, rather than as summaries of responses to particular questions. The final themes broadly correspond to the four areas of inquiry, which is to be expected given that these areas structured the interviews; the interpretive content of each theme, however, was generated through analysis. Interpretations that were not anticipated by the framework or the interview questions include peer-mediated calibration as the main route through which nurses learned to use the systems, scepticism as an early interpretive strategy among senior nurses, negotiation as a third response mode alongside overriding and deferring, the dependence of the perceived safety value of AI on nurses’ available attentional capacity, and the defensive documentation associated with protocols that required justification of non-action. Supplementary File S2 traces, for each theme, the relationships among the framework concepts, the areas of inquiry, illustrative initial codes, and the final interpretation.</w:t>
+        <w:t xml:space="preserve">The analysis combined deductive and inductive elements. The orienting framework shaped the four areas of inquiry, and therefore what participants were asked, but no codebook or predefined themes were applied. Initial codes were generated inductively at semantic and latent levels, and candidate themes were built around central organising concepts rather than as summaries of responses to particular questions. The final themes broadly correspond to the areas of inquiry, as expected given that these structured the interviews, but their interpretive content was generated through analysis. Interpretations not anticipated by the framework or guide include peer-mediated calibration, scepticism as an early interpretive strategy among senior nurses, negotiation as a third response mode, the dependence of the perceived safety value of AI on attentional capacity, and defensive documentation where non-action required justification. Supplementary File S2 traces the relationships among framework concepts, areas of inquiry, illustrative initial codes, and final themes.</w:t>
       </w:r>
     </w:p>
     <w:p>
@@ -3232,7 +3229,7 @@
         <w:rPr>
           <w:rFonts w:asciiTheme="majorBidi" w:hAnsiTheme="majorBidi" w:cstheme="majorBidi"/>
         </w:rPr>
-        <w:t xml:space="preserve">Site-level differences in system type, exposure, training, and response protocols (Table 1) were treated as interpretive context rather than as variables for comparison. Coded extracts were tagged by site, and analytic memos examined how accounts of alert interpretation, trust, and escalation related to local protocols, training, and length of exposure. This informed, for example, the interpretation of the more defensive orientation to alert management described at Hospital D, where non-action required documented justification, and of the more collaborative stance described by participants at Hospital A.</w:t>
+        <w:t xml:space="preserve">Site-level differences (Table 1) were treated as interpretive context rather than as variables for comparison: extracts were tagged by site, and analytic memos examined how accounts of alert interpretation, trust, and escalation related to local protocols, training, and exposure. This informed, for example, the interpretation of defensive alert management at Hospital D, where non-action required documented justification, and of the more collaborative stance described at Hospital A.</w:t>
       </w:r>
     </w:p>
     <w:p>
@@ -3375,72 +3372,19 @@
         <w:rPr>
           <w:rFonts w:asciiTheme="majorBidi" w:hAnsiTheme="majorBidi" w:cstheme="majorBidi"/>
         </w:rPr>
-        <w:t xml:space="preserve">Methodological rigour was established using trustworthiness criteria consistent with Interpretive Description and reflexive thematic analysis </w:t>
-      </w:r>
-      <w:r>
-        <w:rPr>
-          <w:rFonts w:asciiTheme="majorBidi" w:hAnsiTheme="majorBidi" w:cstheme="majorBidi"/>
-          <w:noProof/>
-        </w:rPr>
-        <w:t>[52]</w:t>
-      </w:r>
-      <w:r>
-        <w:rPr>
-          <w:rFonts w:asciiTheme="majorBidi" w:hAnsiTheme="majorBidi" w:cstheme="majorBidi"/>
-        </w:rPr>
-        <w:t>. Interpretive sufficiency, rather than data saturation, was used as the primary criterion for analytic adequacy</w:t>
-      </w:r>
-      <w:r>
-        <w:rPr>
-          <w:rFonts w:asciiTheme="majorBidi" w:hAnsiTheme="majorBidi" w:cstheme="majorBidi"/>
-          <w:rtl/>
-        </w:rPr>
-        <w:t>.</w:t>
-      </w:r>
-      <w:r>
-        <w:rPr>
-          <w:rFonts w:asciiTheme="majorBidi" w:hAnsiTheme="majorBidi" w:cstheme="majorBidi"/>
-        </w:rPr>
-        <w:t xml:space="preserve"> Credibility was supported through sustained engagement with the dataset, regular research team meetings, and peer debriefing with an experienced qualitative nursing researcher external to the study, conducted at two structured points during analysis </w:t>
-      </w:r>
-      <w:r>
-        <w:rPr>
-          <w:rFonts w:asciiTheme="majorBidi" w:hAnsiTheme="majorBidi" w:cstheme="majorBidi"/>
-          <w:noProof/>
-        </w:rPr>
-        <w:t>[53, 54]</w:t>
-      </w:r>
-      <w:r>
-        <w:rPr>
-          <w:rFonts w:asciiTheme="majorBidi" w:hAnsiTheme="majorBidi" w:cstheme="majorBidi"/>
-        </w:rPr>
-        <w:t xml:space="preserve">. Member checking was undertaken with a purposively selected subset of six participants, who reviewed summary accounts of the emerging themes </w:t>
-      </w:r>
-      <w:r>
-        <w:rPr>
-          <w:rFonts w:asciiTheme="majorBidi" w:hAnsiTheme="majorBidi" w:cstheme="majorBidi"/>
-          <w:noProof/>
-        </w:rPr>
-        <w:t>[55, 56]</w:t>
-      </w:r>
-      <w:r>
-        <w:rPr>
-          <w:rFonts w:asciiTheme="majorBidi" w:hAnsiTheme="majorBidi" w:cstheme="majorBidi"/>
-        </w:rPr>
-        <w:t xml:space="preserve">. Their feedback was documented and used to refine the specificity and contextual accuracy of theme descriptions. Dependability was supported through a detailed audit trail documenting recruitment decisions, coding development, analytic memos, theme refinement, and team discussions </w:t>
-      </w:r>
-      <w:r>
-        <w:rPr>
-          <w:rFonts w:asciiTheme="majorBidi" w:hAnsiTheme="majorBidi" w:cstheme="majorBidi"/>
-          <w:noProof/>
-        </w:rPr>
-        <w:t>[57]</w:t>
-      </w:r>
-      <w:r>
-        <w:rPr>
-          <w:rFonts w:asciiTheme="majorBidi" w:hAnsiTheme="majorBidi" w:cstheme="majorBidi"/>
-        </w:rPr>
-        <w:t xml:space="preserve">. </w:t>
+        <w:t xml:space="preserve">Methodological rigour was established using trustworthiness criteria consistent with Interpretive Description and reflexive thematic analysis [52]. Interpretive sufficiency, rather than data saturation, was used as the primary criterion for analytic adequacy. Credibility was supported through sustained engagement with the dataset, regular research team meetings, and peer debriefing with an experienced qualitative nursing researcher external to the study, conducted at two structured points during analysis [53, 54]. Member checking was undertaken with a purposively selected subset of six participants, who reviewed summary accounts of the emerging themes [55, 56]. Their feedback was documented and used to refine the specificity and contextual accuracy of theme descriptions.</w:t>
+      </w:r>
+      <w:r>
+        <w:rPr>
+          <w:rFonts w:asciiTheme="majorBidi" w:hAnsiTheme="majorBidi" w:cstheme="majorBidi"/>
+        </w:rPr>
+        <w:t xml:space="preserve"> Full transcripts were not returned to participants [AUTHOR: confirm].</w:t>
+      </w:r>
+      <w:r>
+        <w:rPr>
+          <w:rFonts w:asciiTheme="majorBidi" w:hAnsiTheme="majorBidi" w:cstheme="majorBidi"/>
+        </w:rPr>
+        <w:t xml:space="preserve"> Dependability was supported through a detailed audit trail documenting recruitment decisions, coding development, analytic memos, theme refinement, and team discussions [57]. </w:t>
       </w:r>
     </w:p>
     <w:p>
@@ -3520,7 +3464,7 @@
         <w:rPr>
           <w:rFonts w:asciiTheme="majorBidi" w:hAnsiTheme="majorBidi" w:cstheme="majorBidi"/>
         </w:rPr>
-        <w:t xml:space="preserve">The principal investigator is a male nurse academic whose clinical background is in critical care and paediatric nursing [AUTHOR: specify previous clinical roles and approximate years of practice, e.g., “who worked as an adult ICU staff nurse for X years before entering academia”]. He had no employment, managerial, supervisory, or teaching relationship with the participating units or participants and had not worked at any of the four hospitals [AUTHOR: confirm; if any participant was a former student or colleague, state this and how it was managed]. His clinical familiarity with critical care supported rapport and the understanding of clinical terminology but also risked the assumption of shared meanings. He therefore invited participants to explain situations and terms in their own words and recorded in the reflexive journal instances in which his clinical assumptions shaped follow-up questions; these entries were reviewed in research team meetings.</w:t>
+        <w:t xml:space="preserve">The principal investigator is a male nurse academic with a clinical background in critical care and paediatric nursing [AUTHOR: specify roles and years, e.g., “six years as an adult ICU staff nurse”]. He had no employment, managerial, supervisory, or teaching relationship with the participating units or participants and had not worked at any of the four hospitals [AUTHOR: confirm; if any prior relationship existed, state how it was managed]. To limit the assumption of shared clinical meanings, he asked participants to explain situations in their own words and recorded in the reflexive journal where his assumptions shaped follow-up questions; these entries were reviewed in team meetings.</w:t>
       </w:r>
     </w:p>
     <w:p>
@@ -3583,7 +3527,19 @@
         <w:rPr>
           <w:rFonts w:asciiTheme="majorBidi" w:hAnsiTheme="majorBidi" w:cstheme="majorBidi"/>
         </w:rPr>
-        <w:t xml:space="preserve">The study participants ranged in age from 26 to 51 years and had between 2 and 23 years of critical care experience. All 23 participants were registered nurses employed in adult critical care units across the four participating hospitals and had direct, active experience working with AI-assisted early-warning or clinical decision-support systems as part of their everyday nursing roles. The sample reflected the multinational composition characteristic of the Saudi critical care nursing workforce and provided variation in hospital site, professional experience, nationality, and educational preparation.</w:t>
+        <w:t xml:space="preserve">The study participants ranged in age from 26 to 51 years and had between 2 and 23 years of critical care experience.</w:t>
+      </w:r>
+      <w:r>
+        <w:rPr>
+          <w:rFonts w:asciiTheme="majorBidi" w:hAnsiTheme="majorBidi" w:cstheme="majorBidi"/>
+        </w:rPr>
+        <w:t xml:space="preserve"> All 23 participants were registered nurses employed in adult critical care units across the four participating hospitals and had direct, active experience of working with the AI-assisted early warning systems in use at their hospitals as part of their everyday nursing roles.</w:t>
+      </w:r>
+      <w:r>
+        <w:rPr>
+          <w:rFonts w:asciiTheme="majorBidi" w:hAnsiTheme="majorBidi" w:cstheme="majorBidi"/>
+        </w:rPr>
+        <w:t xml:space="preserve"> The sample reflected the multinational composition characteristic of the Saudi critical care nursing workforce and provided variation in hospital site, professional experience, nationality, and educational preparation.</w:t>
       </w:r>
       <w:r>
         <w:rPr>
@@ -7526,7 +7482,13 @@
         <w:rPr>
           <w:rFonts w:asciiTheme="majorBidi" w:hAnsiTheme="majorBidi" w:cstheme="majorBidi"/>
         </w:rPr>
-        <w:t xml:space="preserve"> Saudi Arabia (n = 7), the Philippines (n = 5), Jordan (n = 3), Egypt (n = 3), India (n = 3), and Sudan (n = 2). Critical care experience ranged from 2 to 23 years. Most participants held a Bachelor of Science in Nursing (BSN; n = 17), five held a Master of Science in Nursing (MSN), and one held a doctoral qualification.</w:t>
+        <w:t xml:space="preserve"> Saudi Arabia (n = 7), the Philippines (n = 5), Jordan (n = 3), Egypt (n = 3), India (n = 3), and Sudan (n = 2).</w:t>
+      </w:r>
+      <w:r>
+        <w:rPr>
+          <w:rFonts w:asciiTheme="majorBidi" w:hAnsiTheme="majorBidi" w:cstheme="majorBidi"/>
+        </w:rPr>
+        <w:t xml:space="preserve"> Most participants held a Bachelor of Science in Nursing (BSN; n = 17), five held a Master of Science in Nursing (MSN), and one held a doctoral qualification.</w:t>
       </w:r>
       <w:r>
         <w:rPr>
@@ -10460,7 +10422,7 @@
           <w:sz w:val="20"/>
           <w:szCs w:val="20"/>
         </w:rPr>
-        <w:t xml:space="preserve">. Themes are shown with their subthemes; connecting lines indicate interpretive relationships between themes rather than causal pathways. The figure was created by the authors; no artificial intelligence tools were used in its creation or enhancement.</w:t>
+        <w:t xml:space="preserve">. Themes are shown with their subthemes; connecting lines indicate interpretive relationships, not causal pathways. No artificial intelligence tools were used to create or enhance this figure.</w:t>
       </w:r>
     </w:p>
     <w:p>
@@ -10546,7 +10508,7 @@
         <w:rPr>
           <w:rFonts w:asciiTheme="majorBidi" w:hAnsiTheme="majorBidi" w:cstheme="majorBidi"/>
         </w:rPr>
-        <w:t xml:space="preserve"> Earlier work has largely conceptualised technology acceptance as an attitude or intention assessed at, or soon after, the point of adoption [9, 36, 62, 63]; the present findings extend this work by showing that acceptance is not a fixed starting point but an experience shaped through everyday practice, consistent with frameworks that emphasise the continuing mutual adaptation of technologies, users, and organisations over time [64]. In the Saudi context, where internationally recruited nurses form a large proportion of the nursing workforce [65], this process may be further complicated for nurses who must adapt simultaneously to a new organisational and cultural environment [66] and to a new digital system. The prominence of peer-mediated learning is consistent with accounts of clinical expertise as developed through experience and shared practical knowledge [67], and suggests that informal socialisation remains central to how AI becomes usable in practice, while also introducing variability in the quality of knowledge transfer. These findings point to the need for structured onboarding.</w:t>
+        <w:t xml:space="preserve"> Earlier work has largely treated technology acceptance as an attitude or intention measured at adoption [9, 36, 62, 63]; these findings suggest instead that acceptance develops through everyday practice, consistent with frameworks emphasising the continuing mutual adaptation of technologies, users, and organisations [64]. In Saudi Arabia, where internationally recruited nurses form a large share of the nursing workforce [65], this may be further complicated for nurses adapting simultaneously to a new organisational and cultural environment [66] and a new digital system. The prominence of peer-mediated learning is consistent with accounts of expertise developing through experience and shared practical knowledge [67]; it makes informal socialisation central to how AI becomes usable but introduces variability in what is learned, pointing to the need for structured onboarding.</w:t>
       </w:r>
       <w:r>
         <w:rPr>
@@ -10939,7 +10901,7 @@
         <w:rPr>
           <w:rFonts w:asciiTheme="majorBidi" w:hAnsiTheme="majorBidi" w:cstheme="majorBidi"/>
         </w:rPr>
-        <w:t xml:space="preserve">The four sites used different AI-assisted systems with different alert types, implementation histories, training provision, and response protocols (Table 1). This heterogeneity was analytically useful, particularly for understanding how local governance shaped nurses’ engagement, but it means that the findings describe nurses’ experiences of AI-assisted early warning as implemented locally rather than the performance or effects of any single algorithm. In addition, AI-generated alerts were encountered alongside conventional monitor alarms, and participants’ accounts may not always have distinguished between the two; experiences of alert burden in particular may therefore reflect the cumulative alerting environment of the ICU rather than the AI-assisted component alone. Future studies could combine interviews with system audit data to distinguish these sources.</w:t>
+        <w:t xml:space="preserve">The four sites used different systems, alert types, implementation histories, training, and response protocols (Table 1). Some patterns were reported at all four sites (peer-mediated calibration, concern about false-positive alerts, and inadequate preparation), suggesting that they reflect engagement with AI-assisted early warning generally; others were site-specific, notably the defensive alert management linked to the documented-justification requirement at Hospital D. The findings therefore describe AI-assisted early warning as implemented locally, not the performance of any single algorithm. Because AI-generated alerts were encountered alongside conventional monitor alarms, which participants may not always have distinguished, accounts of alert burden may reflect the cumulative alerting environment; future studies could combine interviews with system audit data.</w:t>
       </w:r>
     </w:p>
     <w:p>
@@ -10956,7 +10918,7 @@
         <w:rPr>
           <w:rFonts w:asciiTheme="majorBidi" w:hAnsiTheme="majorBidi" w:cstheme="majorBidi"/>
         </w:rPr>
-        <w:t xml:space="preserve">Participants were aged 26 to 51 years. The absence of newly qualified nurses reflects the eligibility requirement of at least one year of critical care experience, whereas the absence of nurses older than 51 years may reflect the exclusion of nurses in solely managerial roles and the voluntary recruitment approach. Workforce data were not available to establish whether this age profile was representative of critical care nurses at the participating hospitals or in Saudi Arabia more broadly, where internationally recruited nurses form a large proportion of the nursing workforce [65]. Because age and career stage may shape both familiarity with digital technologies and confidence in exercising independent clinical judgment [67], the experiences of late-career nurses, like those of novices, may differ from those reported here. Interviews were conducted by a nurse academic, and participants may have offered accounts they considered professionally appropriate despite assurances of confidentiality. Finally, the four themes broadly correspond to the four areas of inquiry in the interview guide. Although the interpretive content of each theme was developed through analysis (Section 2.8 and Supplementary File S2), the organisation of the findings partly reflects the domains that participants were invited to discuss.</w:t>
+        <w:t xml:space="preserve">Participants were aged 26 to 51 years. Newly qualified nurses were excluded by the one-year experience criterion, and the absence of nurses older than 51 may reflect the exclusion of solely managerial roles and voluntary recruitment. Workforce data were not available to establish whether this profile is representative of critical care nurses at these hospitals or nationally, where internationally recruited nurses form a large share of the workforce [65]. Because career stage may shape engagement with digital technologies and confidence in independent judgment [67], the experiences of late-career nurses and novices may differ. Participants may also have offered professionally favourable accounts to a nurse-academic interviewer. Finally, the four themes broadly correspond to the guide’s four areas of inquiry; although their interpretive content was developed through analysis (Section 2.8; Supplementary File S2), the organisation of the findings partly reflects the domains discussed.</w:t>
       </w:r>
     </w:p>
     <w:p>

</xml_diff>

<commit_message>
Final R1 package: author data inserted, Figure 2 redrawn, full alignment
All placeholders filled with author-supplied data (Table 1, recruitment,
interview counts, PI background); Figure 2 redrawn from Table 3 with
AI-assisted plotting code disclosed; letter, title page, S2 and S3
updated; verification passes with zero problems.

Co-Authored-By: Claude Opus 5.5 <noreply@anthropic.com>
Claude-Session: https://claude.ai/code/session_01JkvFf7XfdbY5dmuffLJMTa
</commit_message>
<xml_diff>
--- a/R1_Resubmission/Manuscript_Revised_Clean.docx
+++ b/R1_Resubmission/Manuscript_Revised_Clean.docx
@@ -1168,7 +1168,7 @@
         <w:rPr>
           <w:rFonts w:asciiTheme="majorBidi" w:hAnsiTheme="majorBidi" w:cstheme="majorBidi"/>
         </w:rPr>
-        <w:t xml:space="preserve">For this study, AI-assisted early warning systems were defined as systems that apply machine-learning or other data-driven predictive algorithms to multiple, continuously updated physiological, laboratory, and clinical data to generate patient-specific deterioration risk estimates or alerts. Single-parameter monitor alarms and rule-based scores with fixed thresholds were not considered AI-assisted, although monitor alarms operated alongside the AI-assisted systems in all units. Table 1 summarises each site’s system (purpose, AI component, alert types, workflow integration, implementation period, training, and response protocol) and participants’ self-reported exposure. Site-level information was obtained from [AUTHOR: insert source, e.g., hospital nursing informatics departments]; vendor and product names are withheld to preserve institutional anonymity.</w:t>
+        <w:t xml:space="preserve">For this study, AI-assisted early warning systems were defined as systems that apply machine-learning or other data-driven predictive algorithms to multiple, continuously updated physiological, laboratory, and clinical data to generate patient-specific deterioration risk estimates or alerts. Single-parameter monitor alarms and rule-based scores with fixed thresholds were not considered AI-assisted, although monitor alarms operated alongside the AI-assisted systems in all units. Table 1 summarises each site’s system (purpose, AI component, alert types, workflow integration, implementation period, training, and response protocol) and participants’ self-reported exposure. Vendor and product names are withheld to preserve institutional anonymity.</w:t>
       </w:r>
     </w:p>
     <w:p>
@@ -1546,7 +1546,7 @@
                 <w:sz w:val="22"/>
                 <w:szCs w:val="22"/>
               </w:rPr>
-              <w:t xml:space="preserve">[AUTHOR: insert]</w:t>
+              <w:t xml:space="preserve">Multivariable machine-learning models estimate sepsis and respiratory deterioration risk from vital signs, laboratory results and clinical records.</w:t>
             </w:r>
           </w:p>
         </w:tc>
@@ -1572,7 +1572,7 @@
                 <w:sz w:val="22"/>
                 <w:szCs w:val="22"/>
               </w:rPr>
-              <w:t xml:space="preserve">[AUTHOR: insert]</w:t>
+              <w:t xml:space="preserve">Multivariable machine-learning model estimates general deterioration risk from vital-sign trends, laboratory results and clinical records.</w:t>
             </w:r>
           </w:p>
         </w:tc>
@@ -1598,7 +1598,7 @@
                 <w:sz w:val="22"/>
                 <w:szCs w:val="22"/>
               </w:rPr>
-              <w:t xml:space="preserve">[AUTHOR: insert]</w:t>
+              <w:t xml:space="preserve">Multivariable machine-learning models estimate sepsis and respiratory deterioration risk from longitudinal physiological and laboratory data.</w:t>
             </w:r>
           </w:p>
         </w:tc>
@@ -1624,7 +1624,7 @@
                 <w:sz w:val="22"/>
                 <w:szCs w:val="22"/>
               </w:rPr>
-              <w:t xml:space="preserve">[AUTHOR: insert]</w:t>
+              <w:t xml:space="preserve">Multivariable machine-learning model estimates general deterioration risk, incorporating vital signs and laboratory trends, including lactate.</w:t>
             </w:r>
           </w:p>
         </w:tc>
@@ -1678,7 +1678,7 @@
                 <w:sz w:val="22"/>
                 <w:szCs w:val="22"/>
               </w:rPr>
-              <w:t xml:space="preserve">[AUTHOR: insert]</w:t>
+              <w:t xml:space="preserve">Sepsis risk; respiratory deterioration risk</w:t>
             </w:r>
           </w:p>
         </w:tc>
@@ -1704,7 +1704,7 @@
                 <w:sz w:val="22"/>
                 <w:szCs w:val="22"/>
               </w:rPr>
-              <w:t xml:space="preserve">[AUTHOR: insert]</w:t>
+              <w:t xml:space="preserve">Composite deterioration risk; persistent high-risk trend</w:t>
             </w:r>
           </w:p>
         </w:tc>
@@ -1730,7 +1730,7 @@
                 <w:sz w:val="22"/>
                 <w:szCs w:val="22"/>
               </w:rPr>
-              <w:t xml:space="preserve">[AUTHOR: insert]</w:t>
+              <w:t xml:space="preserve">Sepsis risk; respiratory deterioration risk</w:t>
             </w:r>
           </w:p>
         </w:tc>
@@ -1756,7 +1756,7 @@
                 <w:sz w:val="22"/>
                 <w:szCs w:val="22"/>
               </w:rPr>
-              <w:t xml:space="preserve">[AUTHOR: insert]</w:t>
+              <w:t xml:space="preserve">Composite deterioration risk; worsening multivariable trend</w:t>
             </w:r>
           </w:p>
         </w:tc>
@@ -1810,7 +1810,7 @@
                 <w:sz w:val="22"/>
                 <w:szCs w:val="22"/>
               </w:rPr>
-              <w:t xml:space="preserve">[AUTHOR: insert]</w:t>
+              <w:t xml:space="preserve">Electronic record risk panel and central dashboard; bedside nurse reviews and discusses with charge nurse.</w:t>
             </w:r>
           </w:p>
         </w:tc>
@@ -1836,7 +1836,7 @@
                 <w:sz w:val="22"/>
                 <w:szCs w:val="22"/>
               </w:rPr>
-              <w:t xml:space="preserve">[AUTHOR: insert]</w:t>
+              <w:t xml:space="preserve">Central dashboard and electronic record notification; bedside nurse acknowledges and informs charge nurse.</w:t>
             </w:r>
           </w:p>
         </w:tc>
@@ -1862,7 +1862,7 @@
                 <w:sz w:val="22"/>
                 <w:szCs w:val="22"/>
               </w:rPr>
-              <w:t xml:space="preserve">[AUTHOR: insert]</w:t>
+              <w:t xml:space="preserve">Electronic record risk panel and bedside workstation notification; nurse reviews trends and escalates concerns.</w:t>
             </w:r>
           </w:p>
         </w:tc>
@@ -1888,7 +1888,7 @@
                 <w:sz w:val="22"/>
                 <w:szCs w:val="22"/>
               </w:rPr>
-              <w:t xml:space="preserve">[AUTHOR: insert]</w:t>
+              <w:t xml:space="preserve">Central dashboard and electronic record task list; bedside and charge nurses review; response is documented.</w:t>
             </w:r>
           </w:p>
         </w:tc>
@@ -1916,7 +1916,7 @@
                 <w:sz w:val="22"/>
                 <w:szCs w:val="22"/>
               </w:rPr>
-              <w:t xml:space="preserve">Time since implementation at data collection</w:t>
+              <w:t xml:space="preserve">Time since implementation at data collection (January 2026)</w:t>
             </w:r>
           </w:p>
         </w:tc>
@@ -1942,7 +1942,7 @@
                 <w:sz w:val="22"/>
                 <w:szCs w:val="22"/>
               </w:rPr>
-              <w:t xml:space="preserve">[AUTHOR: insert]</w:t>
+              <w:t xml:space="preserve">January 2023; 36 months</w:t>
             </w:r>
           </w:p>
         </w:tc>
@@ -1968,7 +1968,7 @@
                 <w:sz w:val="22"/>
                 <w:szCs w:val="22"/>
               </w:rPr>
-              <w:t xml:space="preserve">[AUTHOR: insert]</w:t>
+              <w:t xml:space="preserve">January 2024; 24 months</w:t>
             </w:r>
           </w:p>
         </w:tc>
@@ -1994,7 +1994,7 @@
                 <w:sz w:val="22"/>
                 <w:szCs w:val="22"/>
               </w:rPr>
-              <w:t xml:space="preserve">[AUTHOR: insert]</w:t>
+              <w:t xml:space="preserve">July 2023; 30 months</w:t>
             </w:r>
           </w:p>
         </w:tc>
@@ -2020,7 +2020,7 @@
                 <w:sz w:val="22"/>
                 <w:szCs w:val="22"/>
               </w:rPr>
-              <w:t xml:space="preserve">[AUTHOR: insert]</w:t>
+              <w:t xml:space="preserve">July 2022; 42 months</w:t>
             </w:r>
           </w:p>
         </w:tc>
@@ -2074,7 +2074,7 @@
                 <w:sz w:val="22"/>
                 <w:szCs w:val="22"/>
               </w:rPr>
-              <w:t xml:space="preserve">[AUTHOR: insert]</w:t>
+              <w:t xml:space="preserve">One demonstration and quick-reference guide; peer support thereafter.</w:t>
             </w:r>
           </w:p>
         </w:tc>
@@ -2100,7 +2100,7 @@
                 <w:sz w:val="22"/>
                 <w:szCs w:val="22"/>
               </w:rPr>
-              <w:t xml:space="preserve">[AUTHOR: insert]</w:t>
+              <w:t xml:space="preserve">Two introductory sessions; attendance varied; limited refresher support.</w:t>
             </w:r>
           </w:p>
         </w:tc>
@@ -2126,7 +2126,7 @@
                 <w:sz w:val="22"/>
                 <w:szCs w:val="22"/>
               </w:rPr>
-              <w:t xml:space="preserve">[AUTHOR: insert]</w:t>
+              <w:t xml:space="preserve">One workshop and case examples; peer coaching thereafter.</w:t>
             </w:r>
           </w:p>
         </w:tc>
@@ -2152,7 +2152,7 @@
                 <w:sz w:val="22"/>
                 <w:szCs w:val="22"/>
               </w:rPr>
-              <w:t xml:space="preserve">[AUTHOR: insert]</w:t>
+              <w:t xml:space="preserve">One orientation on alerts and documentation; support through unit educators.</w:t>
             </w:r>
           </w:p>
         </w:tc>
@@ -2206,7 +2206,7 @@
                 <w:sz w:val="22"/>
                 <w:szCs w:val="22"/>
               </w:rPr>
-              <w:t xml:space="preserve">[AUTHOR: insert]</w:t>
+              <w:t xml:space="preserve">Bedside assessment and trend review; escalate according to clinical concern; record response and rationale.</w:t>
             </w:r>
           </w:p>
         </w:tc>
@@ -2232,7 +2232,7 @@
                 <w:sz w:val="22"/>
                 <w:szCs w:val="22"/>
               </w:rPr>
-              <w:t xml:space="preserve">[AUTHOR: insert]</w:t>
+              <w:t xml:space="preserve">Acknowledge and assess; inform charge nurse and escalate concerns; document the assessment.</w:t>
             </w:r>
           </w:p>
         </w:tc>
@@ -2258,7 +2258,7 @@
                 <w:sz w:val="22"/>
                 <w:szCs w:val="22"/>
               </w:rPr>
-              <w:t xml:space="preserve">[AUTHOR: insert]</w:t>
+              <w:t xml:space="preserve">Assess the patient and trends; discuss discordant alerts with the treating team; document the response.</w:t>
             </w:r>
           </w:p>
         </w:tc>
@@ -2312,7 +2312,7 @@
                 <w:sz w:val="22"/>
                 <w:szCs w:val="22"/>
               </w:rPr>
-              <w:t xml:space="preserve">Participants’ duration of system use, n (&lt;6 months / 6–12 months / 1–3 years / &gt;3 years)</w:t>
+              <w:t xml:space="preserve">Participants’ duration of system use, n (&lt;6 months / 6–12 months / &gt;12–36 months / &gt;36 months)</w:t>
             </w:r>
           </w:p>
         </w:tc>
@@ -2338,7 +2338,7 @@
                 <w:sz w:val="22"/>
                 <w:szCs w:val="22"/>
               </w:rPr>
-              <w:t xml:space="preserve">[AUTHOR: insert]</w:t>
+              <w:t xml:space="preserve">1 / 1 / 3 / 0</w:t>
             </w:r>
           </w:p>
         </w:tc>
@@ -2364,7 +2364,7 @@
                 <w:sz w:val="22"/>
                 <w:szCs w:val="22"/>
               </w:rPr>
-              <w:t xml:space="preserve">[AUTHOR: insert]</w:t>
+              <w:t xml:space="preserve">1 / 2 / 3 / 0</w:t>
             </w:r>
           </w:p>
         </w:tc>
@@ -2390,7 +2390,7 @@
                 <w:sz w:val="22"/>
                 <w:szCs w:val="22"/>
               </w:rPr>
-              <w:t xml:space="preserve">[AUTHOR: insert]</w:t>
+              <w:t xml:space="preserve">1 / 1 / 4 / 0</w:t>
             </w:r>
           </w:p>
         </w:tc>
@@ -2416,7 +2416,7 @@
                 <w:sz w:val="22"/>
                 <w:szCs w:val="22"/>
               </w:rPr>
-              <w:t xml:space="preserve">[AUTHOR: insert]</w:t>
+              <w:t xml:space="preserve">0 / 1 / 3 / 2</w:t>
             </w:r>
           </w:p>
         </w:tc>
@@ -2444,7 +2444,7 @@
                 <w:sz w:val="22"/>
                 <w:szCs w:val="22"/>
               </w:rPr>
-              <w:t xml:space="preserve">Participants reporting formal training on the system, n</w:t>
+              <w:t xml:space="preserve">Participants reporting formal training on the system, n (% within site)</w:t>
             </w:r>
           </w:p>
         </w:tc>
@@ -2470,7 +2470,7 @@
                 <w:sz w:val="22"/>
                 <w:szCs w:val="22"/>
               </w:rPr>
-              <w:t xml:space="preserve">[AUTHOR: insert]</w:t>
+              <w:t xml:space="preserve">3 (60.0)</w:t>
             </w:r>
           </w:p>
         </w:tc>
@@ -2496,7 +2496,7 @@
                 <w:sz w:val="22"/>
                 <w:szCs w:val="22"/>
               </w:rPr>
-              <w:t xml:space="preserve">[AUTHOR: insert]</w:t>
+              <w:t xml:space="preserve">4 (66.7)</w:t>
             </w:r>
           </w:p>
         </w:tc>
@@ -2522,7 +2522,7 @@
                 <w:sz w:val="22"/>
                 <w:szCs w:val="22"/>
               </w:rPr>
-              <w:t xml:space="preserve">[AUTHOR: insert]</w:t>
+              <w:t xml:space="preserve">3 (50.0)</w:t>
             </w:r>
           </w:p>
         </w:tc>
@@ -2548,7 +2548,7 @@
                 <w:sz w:val="22"/>
                 <w:szCs w:val="22"/>
               </w:rPr>
-              <w:t xml:space="preserve">[AUTHOR: insert]</w:t>
+              <w:t xml:space="preserve">4 (66.7)</w:t>
             </w:r>
           </w:p>
         </w:tc>
@@ -2576,7 +2576,7 @@
                 <w:sz w:val="22"/>
                 <w:szCs w:val="22"/>
               </w:rPr>
-              <w:t xml:space="preserve">Participants with prior experience of similar systems elsewhere, n</w:t>
+              <w:t xml:space="preserve">Participants with prior experience of similar systems elsewhere, n (% within site)</w:t>
             </w:r>
           </w:p>
         </w:tc>
@@ -2602,7 +2602,7 @@
                 <w:sz w:val="22"/>
                 <w:szCs w:val="22"/>
               </w:rPr>
-              <w:t xml:space="preserve">[AUTHOR: insert]</w:t>
+              <w:t xml:space="preserve">2 (40.0)</w:t>
             </w:r>
           </w:p>
         </w:tc>
@@ -2628,7 +2628,7 @@
                 <w:sz w:val="22"/>
                 <w:szCs w:val="22"/>
               </w:rPr>
-              <w:t xml:space="preserve">[AUTHOR: insert]</w:t>
+              <w:t xml:space="preserve">2 (33.3)</w:t>
             </w:r>
           </w:p>
         </w:tc>
@@ -2654,7 +2654,7 @@
                 <w:sz w:val="22"/>
                 <w:szCs w:val="22"/>
               </w:rPr>
-              <w:t xml:space="preserve">[AUTHOR: insert]</w:t>
+              <w:t xml:space="preserve">3 (50.0)</w:t>
             </w:r>
           </w:p>
         </w:tc>
@@ -2680,7 +2680,7 @@
                 <w:sz w:val="22"/>
                 <w:szCs w:val="22"/>
               </w:rPr>
-              <w:t xml:space="preserve">[AUTHOR: insert]</w:t>
+              <w:t xml:space="preserve">2 (33.3)</w:t>
             </w:r>
           </w:p>
         </w:tc>
@@ -2701,7 +2701,7 @@
           <w:sz w:val="20"/>
           <w:szCs w:val="20"/>
         </w:rPr>
-        <w:t xml:space="preserve">Note: Participant exposure data are from the demographic form (Supplementary File S1). Vendor and product names are withheld to protect institutional anonymity. The Hospital D protocol is as described by participants [AUTHOR: confirm against the written protocol]. AI, artificial intelligence.</w:t>
+        <w:t xml:space="preserve">Note: Participant exposure data are from the demographic form (Supplementary File S1); percentages use the site denominator. Overall, system use was &lt;6 months for 3 (13.0%), 6–12 months for 5 (21.7%), &gt;12–36 months for 13 (56.5%) and &gt;36 months for 2 (8.7%) participants; 14/23 (60.9%) reported formal training and 9/23 (39.1%) prior experience of similar systems. Formal training denotes attendance at a scheduled session, not verified competence. The Hospital D protocol is as described by participants and was not checked against a written policy. Vendor and product names are withheld to protect institutional anonymity. AI, artificial intelligence.</w:t>
       </w:r>
     </w:p>
     <w:p>
@@ -2725,7 +2725,7 @@
         <w:rPr>
           <w:rFonts w:asciiTheme="majorBidi" w:hAnsiTheme="majorBidi" w:cstheme="majorBidi"/>
         </w:rPr>
-        <w:t xml:space="preserve"> Data were collected between [AUTHOR: Month YYYY] and [AUTHOR: Month YYYY]. [AUTHOR: state how many nurses contacted the research team and the number of, and reasons for, any who were ineligible, declined, or withdrew; if none, state that all nurses who volunteered and met the eligibility criteria were interviewed and none withdrew.]</w:t>
+        <w:t xml:space="preserve"> Data were collected from January to March 2026. Of the 26 nurses who contacted the research team, three were ineligible because they had less than one year of critical care experience; no eligible volunteer declined, and no participant withdrew.</w:t>
       </w:r>
       <w:r>
         <w:rPr>
@@ -2926,7 +2926,7 @@
         <w:rPr>
           <w:rFonts w:asciiTheme="majorBidi" w:hAnsiTheme="majorBidi" w:cstheme="majorBidi"/>
         </w:rPr>
-        <w:t xml:space="preserve"> Overall, [AUTHOR: n] interviews were conducted face-to-face and [AUTHOR: n] by video; [AUTHOR: n] were conducted in Arabic and [AUTHOR: n] in English. Only the participant and the interviewer were present at each interview, and each participant was interviewed once [AUTHOR: confirm both statements]. Before each interview, participants completed a brief demographic form capturing age, sex, nationality, years of critical care experience, highest educational qualification, the AI-assisted system used in their unit, duration of use of that system, training received, and prior experience with similar systems elsewhere (Supplementary File S1).</w:t>
+        <w:t xml:space="preserve"> Overall, 15 interviews were conducted face-to-face and eight by video; 14 were conducted in Arabic and nine in English. Only the participant and the interviewer were present at each interview, and each participant was interviewed once. Before each interview, participants completed a brief demographic form capturing age, sex, nationality, years of critical care experience, highest educational qualification, the AI-assisted system used in their unit, duration of use of that system, training received, and prior experience with similar systems elsewhere (Supplementary File S1).</w:t>
       </w:r>
       <w:r>
         <w:rPr>
@@ -3378,7 +3378,7 @@
         <w:rPr>
           <w:rFonts w:asciiTheme="majorBidi" w:hAnsiTheme="majorBidi" w:cstheme="majorBidi"/>
         </w:rPr>
-        <w:t xml:space="preserve"> Full transcripts were not returned to participants [AUTHOR: confirm].</w:t>
+        <w:t xml:space="preserve"> Full transcripts were not returned to participants.</w:t>
       </w:r>
       <w:r>
         <w:rPr>
@@ -3464,7 +3464,7 @@
         <w:rPr>
           <w:rFonts w:asciiTheme="majorBidi" w:hAnsiTheme="majorBidi" w:cstheme="majorBidi"/>
         </w:rPr>
-        <w:t xml:space="preserve">The principal investigator is a male nurse academic with a clinical background in critical care and paediatric nursing [AUTHOR: specify roles and years, e.g., “six years as an adult ICU staff nurse”]. He had no employment, managerial, supervisory, or teaching relationship with the participating units or participants and had not worked at any of the four hospitals [AUTHOR: confirm; if any prior relationship existed, state how it was managed]. To limit the assumption of shared clinical meanings, he asked participants to explain situations in their own words and recorded in the reflexive journal where his assumptions shaped follow-up questions; these entries were reviewed in team meetings.</w:t>
+        <w:t xml:space="preserve">The principal investigator is a male nurse academic with six years of adult intensive care nursing experience and three years of paediatric nursing experience. He had no employment, managerial, supervisory, or teaching relationship with the participating units or participants and had not worked at any of the four hospitals. To limit the assumption of shared clinical meanings, he asked participants to explain situations in their own words and recorded in the reflexive journal where his assumptions shaped follow-up questions; these entries were reviewed in team meetings.</w:t>
       </w:r>
     </w:p>
     <w:p>
@@ -10307,7 +10307,7 @@
         <w:lastRenderedPageBreak/>
         <w:drawing>
           <wp:inline distT="0" distB="0" distL="0" distR="0" wp14:anchorId="12A0984D" wp14:editId="666EC99F">
-            <wp:extent cx="5144948" cy="2871787"/>
+            <wp:extent cx="5144948" cy="4691208"/>
             <wp:effectExtent l="0" t="0" r="0" b="5080"/>
             <wp:docPr id="301497738" name="Picture 2" descr="The image illustrates a complex network of interactions between nurses and an Early Warning System (EWS) in a multinational adult ICU setting. It depicts various aspects such as the learning curve, integration of data, managing alarm fatigue, decision-making, and the balance between professional autonomy and system reliability.  AI-generated content may be incorrect."/>
             <wp:cNvGraphicFramePr>
@@ -10338,7 +10338,7 @@
                   <pic:spPr bwMode="auto">
                     <a:xfrm>
                       <a:off x="0" y="0"/>
-                      <a:ext cx="5161377" cy="2880957"/>
+                      <a:ext cx="5161377" cy="4706188"/>
                     </a:xfrm>
                     <a:prstGeom prst="rect">
                       <a:avLst/>
@@ -10372,29 +10372,6 @@
       <w:r>
         <w:rPr>
           <w:rFonts w:asciiTheme="majorBidi" w:hAnsiTheme="majorBidi" w:cstheme="majorBidi"/>
-          <w:sz w:val="20"/>
-          <w:szCs w:val="20"/>
-        </w:rPr>
-        <w:t xml:space="preserve">[AUTHOR: replace the image above with the redrawn Figure 2 before submission; see “Figure 2 redraw specification” in the Final Audit Report.]</w:t>
-      </w:r>
-    </w:p>
-    <w:p>
-      <w:pPr>
-        <w:bidi w:val="0"/>
-        <w:spacing w:line="360" w:lineRule="auto"/>
-        <w:ind w:firstLine="720"/>
-        <w:jc w:val="center"/>
-        <w:rPr>
-          <w:rFonts w:asciiTheme="majorBidi" w:hAnsiTheme="majorBidi" w:cstheme="majorBidi"/>
-          <w:i/>
-          <w:iCs/>
-          <w:sz w:val="20"/>
-          <w:szCs w:val="20"/>
-        </w:rPr>
-      </w:pPr>
-      <w:r>
-        <w:rPr>
-          <w:rFonts w:asciiTheme="majorBidi" w:hAnsiTheme="majorBidi" w:cstheme="majorBidi"/>
           <w:b/>
           <w:bCs/>
           <w:i/>
@@ -10422,7 +10399,7 @@
           <w:sz w:val="20"/>
           <w:szCs w:val="20"/>
         </w:rPr>
-        <w:t xml:space="preserve">. Themes are shown with their subthemes; connecting lines indicate interpretive relationships, not causal pathways. No artificial intelligence tools were used to create or enhance this figure.</w:t>
+        <w:t xml:space="preserve">. Themes are shown with their subthemes; connecting lines indicate interpretive relationships, not causal pathways. The figure was redrawn during revision using AI-assisted plotting code generated from the authors’ thematic structure (Table 3) and was checked by the authors.</w:t>
       </w:r>
     </w:p>
     <w:p>
@@ -12112,7 +12089,7 @@
           <w:kern w:val="0"/>
           <w:lang w:val="pt-BR"/>
         </w:rPr>
-        <w:t xml:space="preserve">47. Yanto A, Nurmalia D, Ilkafah I, Suhariyati S, Pandin MGR. The Impact of Artificial Intelligence on Nursing Practice in Hospital Settings: A Philosophical and Professional Perspective. 2025.</w:t>
+        <w:t xml:space="preserve">47. Yanto A, Nurmalia D, Ilkafah I, Suhariyati S, Pandin MGR. The Impact of Artificial Intelligence on Nursing Practice in Hospital Settings: A Philosophical and Professional Perspective. Research Square [Preprint]. 2025. https://doi.org/10.21203/rs.3.rs-7975002/v1.</w:t>
       </w:r>
     </w:p>
     <w:p>

</xml_diff>